<commit_message>
Update PfBDP1 from 866c900
</commit_message>
<xml_diff>
--- a/docs/manuscripts/pfbdp1-enamine/index.docx
+++ b/docs/manuscripts/pfbdp1-enamine/index.docx
@@ -55,7 +55,7 @@
         <w:pStyle w:val="Date"/>
       </w:pPr>
       <w:r>
-        <w:t xml:space="preserve">2026-08-13</w:t>
+        <w:t xml:space="preserve">2026-09-26</w:t>
       </w:r>
     </w:p>
     <w:p>
@@ -217,13 +217,41 @@
         <w:t xml:space="preserve">predicted interaction and determine antimalarial activity.</w:t>
       </w:r>
     </w:p>
-    <w:bookmarkStart w:id="9" w:name="introduction"/>
+    <w:bookmarkStart w:id="10" w:name="acronyms_HEADER_LOA"/>
     <w:p>
       <w:pPr>
         <w:pStyle w:val="Heading1"/>
       </w:pPr>
       <w:r>
-        <w:t xml:space="preserve">1. Introduction</w:t>
+        <w:t xml:space="preserve">1. List Of Acronyms</w:t>
+      </w:r>
+    </w:p>
+    <w:p>
+      <w:pPr>
+        <w:pStyle w:val="DefinitionTerm"/>
+      </w:pPr>
+      <w:bookmarkStart w:id="9" w:name="acronyms_PfBDP1"/>
+      <w:r>
+        <w:t xml:space="preserve">PfBDP1</w:t>
+      </w:r>
+      <w:bookmarkEnd w:id="9"/>
+    </w:p>
+    <w:p>
+      <w:pPr>
+        <w:pStyle w:val="Definition"/>
+      </w:pPr>
+      <w:r>
+        <w:t xml:space="preserve">Plasmodium falciparum bromodomain protein 1</w:t>
+      </w:r>
+    </w:p>
+    <w:bookmarkEnd w:id="10"/>
+    <w:bookmarkStart w:id="11" w:name="introduction"/>
+    <w:p>
+      <w:pPr>
+        <w:pStyle w:val="Heading1"/>
+      </w:pPr>
+      <w:r>
+        <w:t xml:space="preserve">2. Introduction</w:t>
       </w:r>
     </w:p>
     <w:p>
@@ -304,7 +332,7 @@
         <w:t xml:space="preserve"> </w:t>
       </w:r>
       <w:r>
-        <w:t xml:space="preserve">bromodomain protein 1 (PfBDP1; PF3D7_1033700) is particularly compelling because it is parasite-specific and controls genes required for erythrocyte invasion. Conditional depletion of PfBDP1 disrupts invasion-gene expression, reduces red-blood-cell invasion, and impairs parasite proliferation</w:t>
+        <w:t xml:space="preserve">bromodomain protein 1 (PfBDP1; PF3D7_1033700) is particularly compelling because it controls genes required for erythrocyte invasion. Conditional depletion of PfBDP1 disrupts invasion-gene expression, reduces red-blood-cell invasion, and impairs parasite proliferation</w:t>
       </w:r>
       <w:r>
         <w:t xml:space="preserve"> </w:t>
@@ -378,7 +406,24 @@
         <w:t xml:space="preserve"> </w:t>
       </w:r>
       <w:r>
-        <w:t xml:space="preserve">compounds from the Enamine Screening Collection against the PfBDP1 bromodomain. We</w:t>
+        <w:t xml:space="preserve">compounds from the Enamine Screening Collection against the</w:t>
+      </w:r>
+      <w:r>
+        <w:t xml:space="preserve"> </w:t>
+      </w:r>
+      <w:hyperlink w:anchor="acronyms_PfBDP1">
+        <w:r>
+          <w:rPr>
+            <w:rStyle w:val="Hyperlink"/>
+          </w:rPr>
+          <w:t xml:space="preserve">Plasmodium falciparum bromodomain protein 1 (PfBDP1)</w:t>
+        </w:r>
+      </w:hyperlink>
+      <w:r>
+        <w:t xml:space="preserve"> </w:t>
+      </w:r>
+      <w:r>
+        <w:t xml:space="preserve">bromodomain. We</w:t>
       </w:r>
       <w:r>
         <w:t xml:space="preserve"> </w:t>
@@ -402,38 +447,50 @@
         <w:t xml:space="preserve"> </w:t>
       </w:r>
       <w:r>
-        <w:t xml:space="preserve">and physicochemical criteria, substructure alerts, and pose-quality checks. This</w:t>
-      </w:r>
-      <w:r>
-        <w:t xml:space="preserve"> </w:t>
-      </w:r>
-      <w:r>
-        <w:t xml:space="preserve">workflow was designed to identify chemically plausible PfBDP1-binding candidates</w:t>
-      </w:r>
-      <w:r>
-        <w:t xml:space="preserve"> </w:t>
-      </w:r>
-      <w:r>
-        <w:t xml:space="preserve">for subsequent molecular-dynamics and free-energy evaluation.</w:t>
-      </w:r>
-    </w:p>
-    <w:bookmarkEnd w:id="9"/>
-    <w:bookmarkStart w:id="23" w:name="sec-methods"/>
+        <w:t xml:space="preserve">drug-likeness filtering (QED ≥ 0.30), Lipinski rule-of-five assessment (≤2</w:t>
+      </w:r>
+      <w:r>
+        <w:t xml:space="preserve"> </w:t>
+      </w:r>
+      <w:r>
+        <w:t xml:space="preserve">violations), substructure alerts (≤2 PAINS matches), and pose-quality validation</w:t>
+      </w:r>
+      <w:r>
+        <w:t xml:space="preserve"> </w:t>
+      </w:r>
+      <w:r>
+        <w:t xml:space="preserve">(PoseBusters). This workflow was designed to identify chemically plausible</w:t>
+      </w:r>
+      <w:r>
+        <w:t xml:space="preserve"> </w:t>
+      </w:r>
+      <w:r>
+        <w:t xml:space="preserve">PfBDP1-binding candidates for subsequent molecular-dynamics and free-energy</w:t>
+      </w:r>
+      <w:r>
+        <w:t xml:space="preserve"> </w:t>
+      </w:r>
+      <w:r>
+        <w:t xml:space="preserve">evaluation.</w:t>
+      </w:r>
+    </w:p>
+    <w:bookmarkEnd w:id="11"/>
+    <w:bookmarkStart w:id="25" w:name="sec-methods"/>
     <w:p>
       <w:pPr>
         <w:pStyle w:val="Heading1"/>
       </w:pPr>
       <w:r>
-        <w:t xml:space="preserve">2. Methods</w:t>
-      </w:r>
-    </w:p>
-    <w:bookmarkStart w:id="10" w:name="study-design"/>
+        <w:t xml:space="preserve">3. Methods</w:t>
+      </w:r>
+    </w:p>
+    <w:bookmarkStart w:id="12" w:name="study-design"/>
     <w:p>
       <w:pPr>
         <w:pStyle w:val="Heading2"/>
       </w:pPr>
       <w:r>
-        <w:t xml:space="preserve">2.1 Study design</w:t>
+        <w:t xml:space="preserve">3.1 Study design</w:t>
       </w:r>
     </w:p>
     <w:p>
@@ -466,14 +523,14 @@
         <w:t xml:space="preserve">The complete screening workflow is summarized in Supplementary Figure S2.</w:t>
       </w:r>
     </w:p>
-    <w:bookmarkEnd w:id="10"/>
-    <w:bookmarkStart w:id="11" w:name="compound-library-and-ligand-preparation"/>
+    <w:bookmarkEnd w:id="12"/>
+    <w:bookmarkStart w:id="13" w:name="compound-library-and-ligand-preparation"/>
     <w:p>
       <w:pPr>
         <w:pStyle w:val="Heading2"/>
       </w:pPr>
       <w:r>
-        <w:t xml:space="preserve">2.2 Compound library and ligand preparation</w:t>
+        <w:t xml:space="preserve">3.2 Compound library and ligand preparation</w:t>
       </w:r>
     </w:p>
     <w:p>
@@ -562,14 +619,14 @@
         <w:t xml:space="preserve">. This step assigned AutoDock atom types, partial charges, and rotatable bonds.</w:t>
       </w:r>
     </w:p>
-    <w:bookmarkEnd w:id="11"/>
-    <w:bookmarkStart w:id="14" w:name="target-preparation"/>
+    <w:bookmarkEnd w:id="13"/>
+    <w:bookmarkStart w:id="16" w:name="target-preparation"/>
     <w:p>
       <w:pPr>
         <w:pStyle w:val="Heading2"/>
       </w:pPr>
       <w:r>
-        <w:t xml:space="preserve">2.3 Target preparation</w:t>
+        <w:t xml:space="preserve">3.3 Target preparation</w:t>
       </w:r>
     </w:p>
     <w:p>
@@ -582,7 +639,7 @@
       <w:r>
         <w:t xml:space="preserve"> </w:t>
       </w:r>
-      <w:hyperlink r:id="rId12">
+      <w:hyperlink r:id="rId14">
         <w:r>
           <w:rPr>
             <w:rStyle w:val="Hyperlink"/>
@@ -596,7 +653,7 @@
       <w:r>
         <w:t xml:space="preserve"> </w:t>
       </w:r>
-      <w:hyperlink r:id="rId13">
+      <w:hyperlink r:id="rId15">
         <w:r>
           <w:rPr>
             <w:rStyle w:val="Hyperlink"/>
@@ -643,14 +700,14 @@
         <w:t xml:space="preserve">. The receptor was treated as rigid during docking.</w:t>
       </w:r>
     </w:p>
-    <w:bookmarkEnd w:id="14"/>
-    <w:bookmarkStart w:id="15" w:name="docking-protocol-validation"/>
+    <w:bookmarkEnd w:id="16"/>
+    <w:bookmarkStart w:id="17" w:name="docking-protocol-validation"/>
     <w:p>
       <w:pPr>
         <w:pStyle w:val="Heading2"/>
       </w:pPr>
       <w:r>
-        <w:t xml:space="preserve">2.4 Docking-protocol validation</w:t>
+        <w:t xml:space="preserve">3.4 Docking-protocol validation</w:t>
       </w:r>
     </w:p>
     <w:p>
@@ -744,14 +801,14 @@
         <w:t xml:space="preserve">cognate pose. Exhaustiveness 32 was therefore used for the production screen.</w:t>
       </w:r>
     </w:p>
-    <w:bookmarkEnd w:id="15"/>
-    <w:bookmarkStart w:id="16" w:name="virtual-screening"/>
+    <w:bookmarkEnd w:id="17"/>
+    <w:bookmarkStart w:id="18" w:name="virtual-screening"/>
     <w:p>
       <w:pPr>
         <w:pStyle w:val="Heading2"/>
       </w:pPr>
       <w:r>
-        <w:t xml:space="preserve">2.5 Virtual screening</w:t>
+        <w:t xml:space="preserve">3.5 Virtual screening</w:t>
       </w:r>
     </w:p>
     <w:p>
@@ -789,14 +846,14 @@
         <w:t xml:space="preserve">, and the lowest-scoring pose of each successfully processed compound was retained for post-docking analysis.</w:t>
       </w:r>
     </w:p>
-    <w:bookmarkEnd w:id="16"/>
-    <w:bookmarkStart w:id="17" w:name="post-docking-filtering-and-hit-selection"/>
+    <w:bookmarkEnd w:id="18"/>
+    <w:bookmarkStart w:id="19" w:name="post-docking-filtering-and-hit-selection"/>
     <w:p>
       <w:pPr>
         <w:pStyle w:val="Heading2"/>
       </w:pPr>
       <w:r>
-        <w:t xml:space="preserve">2.6 Post-docking filtering and hit selection</w:t>
+        <w:t xml:space="preserve">3.6 Post-docking filtering and hit selection</w:t>
       </w:r>
     </w:p>
     <w:p>
@@ -804,7 +861,117 @@
         <w:pStyle w:val="FirstParagraph"/>
       </w:pPr>
       <w:r>
-        <w:t xml:space="preserve">The resulting protein-ligand complexes were evaluated with PoseBusters 0.3.7 to identify chemically or geometrically implausible poses</w:t>
+        <w:t xml:space="preserve">Docked compounds were ranked by ascending score. Candidates were filtered by</w:t>
+      </w:r>
+      <w:r>
+        <w:t xml:space="preserve"> </w:t>
+      </w:r>
+      <w:r>
+        <w:t xml:space="preserve">physicochemical and structural criteria. Quantitative estimate of drug-likeness</w:t>
+      </w:r>
+      <w:r>
+        <w:t xml:space="preserve"> </w:t>
+      </w:r>
+      <w:r>
+        <w:t xml:space="preserve">(QED) was calculated with RDKit</w:t>
+      </w:r>
+      <w:r>
+        <w:t xml:space="preserve"> </w:t>
+      </w:r>
+      <w:r>
+        <w:t xml:space="preserve">(Bickerton et al. 2012)</w:t>
+      </w:r>
+      <w:r>
+        <w:t xml:space="preserve">; compounds with QED ≥ 0.30</w:t>
+      </w:r>
+      <w:r>
+        <w:t xml:space="preserve"> </w:t>
+      </w:r>
+      <w:r>
+        <w:t xml:space="preserve">were retained. Lipinski rule-of-five violations were computed from molecular</w:t>
+      </w:r>
+      <w:r>
+        <w:t xml:space="preserve"> </w:t>
+      </w:r>
+      <w:r>
+        <w:t xml:space="preserve">weight, logP, hydrogen-bond donors, and hydrogen-bond acceptors; candidates with</w:t>
+      </w:r>
+      <w:r>
+        <w:t xml:space="preserve"> </w:t>
+      </w:r>
+      <w:r>
+        <w:t xml:space="preserve">two or fewer violations were accepted</w:t>
+      </w:r>
+      <w:r>
+        <w:t xml:space="preserve"> </w:t>
+      </w:r>
+      <w:r>
+        <w:t xml:space="preserve">(Lipinski et al. 1997)</w:t>
+      </w:r>
+      <w:r>
+        <w:t xml:space="preserve">. Potentially</w:t>
+      </w:r>
+      <w:r>
+        <w:t xml:space="preserve"> </w:t>
+      </w:r>
+      <w:r>
+        <w:t xml:space="preserve">problematic substructures were assessed with RDKit’s SMARTS-based</w:t>
+      </w:r>
+      <w:r>
+        <w:t xml:space="preserve"> </w:t>
+      </w:r>
+      <w:r>
+        <w:rPr>
+          <w:rStyle w:val="VerbatimChar"/>
+        </w:rPr>
+        <w:t xml:space="preserve">FilterCatalog</w:t>
+      </w:r>
+      <w:r>
+        <w:t xml:space="preserve">, combining PAINS_A, PAINS_B, PAINS_C, PAINS, BRENK, and NIH</w:t>
+      </w:r>
+      <w:r>
+        <w:t xml:space="preserve"> </w:t>
+      </w:r>
+      <w:r>
+        <w:t xml:space="preserve">collections</w:t>
+      </w:r>
+      <w:r>
+        <w:t xml:space="preserve"> </w:t>
+      </w:r>
+      <w:r>
+        <w:t xml:space="preserve">(</w:t>
+      </w:r>
+      <w:r>
+        <w:t xml:space="preserve">Landrum et al.</w:t>
+      </w:r>
+      <w:r>
+        <w:t xml:space="preserve"> </w:t>
+      </w:r>
+      <w:r>
+        <w:t xml:space="preserve">2026)</w:t>
+      </w:r>
+      <w:r>
+        <w:t xml:space="preserve">. Compounds matching two or fewer PAINS alerts were</w:t>
+      </w:r>
+      <w:r>
+        <w:t xml:space="preserve"> </w:t>
+      </w:r>
+      <w:r>
+        <w:t xml:space="preserve">retained.</w:t>
+      </w:r>
+    </w:p>
+    <w:p>
+      <w:pPr>
+        <w:pStyle w:val="BodyText"/>
+      </w:pPr>
+      <w:r>
+        <w:t xml:space="preserve">The resulting protein-ligand complexes were evaluated with PoseBusters 0.3.7 to</w:t>
+      </w:r>
+      <w:r>
+        <w:t xml:space="preserve"> </w:t>
+      </w:r>
+      <w:r>
+        <w:t xml:space="preserve">identify chemically or geometrically implausible poses</w:t>
       </w:r>
       <w:r>
         <w:t xml:space="preserve"> </w:t>
@@ -813,13 +980,31 @@
         <w:t xml:space="preserve">(Buttenschoen et al. 2024)</w:t>
       </w:r>
       <w:r>
-        <w:t xml:space="preserve">. Only compounds with no failed PoseBusters tests were accepted. Passing structures were ranked by docking score. The five highest-priority compounds were selected for subsequent molecular-dynamics simulation and endpoint free-energy calculations.</w:t>
-      </w:r>
-      <w:r>
-        <w:t xml:space="preserve"> </w:t>
-      </w:r>
-      <w:r>
-        <w:t xml:space="preserve">Docking and hit-selection records are provided in</w:t>
+        <w:t xml:space="preserve">. Only compounds with no failed PoseBusters tests</w:t>
+      </w:r>
+      <w:r>
+        <w:t xml:space="preserve"> </w:t>
+      </w:r>
+      <w:r>
+        <w:t xml:space="preserve">were accepted. Passing structures were ranked by docking score. The five</w:t>
+      </w:r>
+      <w:r>
+        <w:t xml:space="preserve"> </w:t>
+      </w:r>
+      <w:r>
+        <w:t xml:space="preserve">highest-priority compounds were selected for subsequent molecular-dynamics</w:t>
+      </w:r>
+      <w:r>
+        <w:t xml:space="preserve"> </w:t>
+      </w:r>
+      <w:r>
+        <w:t xml:space="preserve">simulation and endpoint free-energy calculations. Docking and hit-selection</w:t>
+      </w:r>
+      <w:r>
+        <w:t xml:space="preserve"> </w:t>
+      </w:r>
+      <w:r>
+        <w:t xml:space="preserve">records are provided in</w:t>
       </w:r>
       <w:r>
         <w:t xml:space="preserve"> </w:t>
@@ -836,14 +1021,14 @@
         <w:t xml:space="preserve">.</w:t>
       </w:r>
     </w:p>
-    <w:bookmarkEnd w:id="17"/>
-    <w:bookmarkStart w:id="18" w:name="in-silico-admet-profiling"/>
+    <w:bookmarkEnd w:id="19"/>
+    <w:bookmarkStart w:id="20" w:name="in-silico-admet-profiling"/>
     <w:p>
       <w:pPr>
         <w:pStyle w:val="Heading2"/>
       </w:pPr>
       <w:r>
-        <w:t xml:space="preserve">2.7 In silico ADMET profiling</w:t>
+        <w:t xml:space="preserve">3.7 In silico ADMET profiling</w:t>
       </w:r>
     </w:p>
     <w:p>
@@ -901,23 +1086,23 @@
         <w:t xml:space="preserve">.</w:t>
       </w:r>
     </w:p>
-    <w:bookmarkEnd w:id="18"/>
-    <w:bookmarkStart w:id="22" w:name="molecular-dynamics-and-mmgbsa-analysis"/>
+    <w:bookmarkEnd w:id="20"/>
+    <w:bookmarkStart w:id="24" w:name="molecular-dynamics-and-mmgbsa-analysis"/>
     <w:p>
       <w:pPr>
         <w:pStyle w:val="Heading2"/>
       </w:pPr>
       <w:r>
-        <w:t xml:space="preserve">2.8 Molecular dynamics and MM/GBSA analysis</w:t>
-      </w:r>
-    </w:p>
-    <w:bookmarkStart w:id="19" w:name="molecular-dynamics-simulations"/>
+        <w:t xml:space="preserve">3.8 Molecular dynamics and MM/GBSA analysis</w:t>
+      </w:r>
+    </w:p>
+    <w:bookmarkStart w:id="21" w:name="molecular-dynamics-simulations"/>
     <w:p>
       <w:pPr>
         <w:pStyle w:val="Heading3"/>
       </w:pPr>
       <w:r>
-        <w:t xml:space="preserve">2.8.1 Molecular dynamics simulations</w:t>
+        <w:t xml:space="preserve">3.8.1 Molecular dynamics simulations</w:t>
       </w:r>
     </w:p>
     <w:p>
@@ -1115,14 +1300,14 @@
         <w:t xml:space="preserve">10 ps, yielding trajectories for subsequent structural and energetic analyses.</w:t>
       </w:r>
     </w:p>
-    <w:bookmarkEnd w:id="19"/>
-    <w:bookmarkStart w:id="20" w:name="trajectory-analysis"/>
+    <w:bookmarkEnd w:id="21"/>
+    <w:bookmarkStart w:id="22" w:name="trajectory-analysis"/>
     <w:p>
       <w:pPr>
         <w:pStyle w:val="Heading3"/>
       </w:pPr>
       <w:r>
-        <w:t xml:space="preserve">2.8.2 Trajectory analysis</w:t>
+        <w:t xml:space="preserve">3.8.2 Trajectory analysis</w:t>
       </w:r>
     </w:p>
     <w:p>
@@ -1133,14 +1318,14 @@
         <w:t xml:space="preserve">Trajectory analyses were performed using the standard built-in GROMACS analysis tools. The structural stability and conformational behavior of each protein–ligand complex were evaluated by calculating the root-mean-square deviation (RMSD), root-mean-square fluctuation (RMSF), radius of gyration (Rg), solvent-accessible surface area (SASA), and intermolecular hydrogen bonds throughout the simulation. Principal component analysis (PCA) was carried out based on the covariance matrix of Cα atomic fluctuations after removal of overall translational and rotational motions. The first two principal components (PC1 and PC2) were subsequently used to construct the projected free-energy landscape (FEL), enabling characterization of the dominant conformational basins sampled during the simulations.</w:t>
       </w:r>
     </w:p>
-    <w:bookmarkEnd w:id="20"/>
-    <w:bookmarkStart w:id="21" w:name="mmgbsa-calculations"/>
+    <w:bookmarkEnd w:id="22"/>
+    <w:bookmarkStart w:id="23" w:name="mmgbsa-calculations"/>
     <w:p>
       <w:pPr>
         <w:pStyle w:val="Heading3"/>
       </w:pPr>
       <w:r>
-        <w:t xml:space="preserve">2.8.3 MM/GBSA calculations</w:t>
+        <w:t xml:space="preserve">3.8.3 MM/GBSA calculations</w:t>
       </w:r>
     </w:p>
     <w:p>
@@ -1638,25 +1823,25 @@
         <w:t xml:space="preserve">.</w:t>
       </w:r>
     </w:p>
-    <w:bookmarkEnd w:id="21"/>
-    <w:bookmarkEnd w:id="22"/>
     <w:bookmarkEnd w:id="23"/>
-    <w:bookmarkStart w:id="44" w:name="results-and-discussion"/>
+    <w:bookmarkEnd w:id="24"/>
+    <w:bookmarkEnd w:id="25"/>
+    <w:bookmarkStart w:id="47" w:name="results-and-discussion"/>
     <w:p>
       <w:pPr>
         <w:pStyle w:val="Heading1"/>
       </w:pPr>
       <w:r>
-        <w:t xml:space="preserve">3. Results and Discussion</w:t>
-      </w:r>
-    </w:p>
-    <w:bookmarkStart w:id="28" w:name="selected-candidate-structures"/>
+        <w:t xml:space="preserve">4. Results and Discussion</w:t>
+      </w:r>
+    </w:p>
+    <w:bookmarkStart w:id="31" w:name="selected-candidate-structures"/>
     <w:p>
       <w:pPr>
         <w:pStyle w:val="Heading2"/>
       </w:pPr>
       <w:r>
-        <w:t xml:space="preserve">3.1 Selected candidate structures</w:t>
+        <w:t xml:space="preserve">4.1 Selected candidate structures</w:t>
       </w:r>
     </w:p>
     <w:p>
@@ -1731,43 +1916,66 @@
         <w:t xml:space="preserve"> </w:t>
       </w:r>
       <w:r>
-        <w:t xml:space="preserve">Z985612796 include</w:t>
-      </w:r>
-      <w:r>
-        <w:t xml:space="preserve"> </w:t>
-      </w:r>
-      <w:r>
-        <w:t xml:space="preserve">extended aromatic systems. Z9302730850 combines fused heterocycles with a</w:t>
-      </w:r>
-      <w:r>
-        <w:t xml:space="preserve"> </w:t>
-      </w:r>
-      <w:r>
-        <w:t xml:space="preserve">chlorophenyl substituent. I5K is smaller and less structurally elaborate than</w:t>
-      </w:r>
-      <w:r>
-        <w:t xml:space="preserve"> </w:t>
-      </w:r>
-      <w:r>
-        <w:t xml:space="preserve">the screened candidates. This diversity enabled comparison of chemically</w:t>
-      </w:r>
-      <w:r>
-        <w:t xml:space="preserve"> </w:t>
-      </w:r>
-      <w:r>
-        <w:t xml:space="preserve">distinct ligands during molecular dynamics, MM/GBSA estimation, and in silico</w:t>
-      </w:r>
-      <w:r>
-        <w:t xml:space="preserve"> </w:t>
-      </w:r>
-      <w:r>
-        <w:t xml:space="preserve">ADMET profiling against the PfBDP1 bromodomain target in subsequent comparative</w:t>
-      </w:r>
-      <w:r>
-        <w:t xml:space="preserve"> </w:t>
-      </w:r>
-      <w:r>
-        <w:t xml:space="preserve">analyses.</w:t>
+        <w:t xml:space="preserve">Z985612796 include extended aromatic systems. Z9302730850 combines fused</w:t>
+      </w:r>
+      <w:r>
+        <w:t xml:space="preserve"> </w:t>
+      </w:r>
+      <w:r>
+        <w:t xml:space="preserve">heterocycles with a chlorophenyl substituent. The annotated functional-group</w:t>
+      </w:r>
+      <w:r>
+        <w:t xml:space="preserve"> </w:t>
+      </w:r>
+      <w:r>
+        <w:t xml:space="preserve">map (</w:t>
+      </w:r>
+      <w:hyperlink r:id="rId26">
+        <w:r>
+          <w:rPr>
+            <w:rStyle w:val="Hyperlink"/>
+          </w:rPr>
+          <w:t xml:space="preserve">Supplementary Figure S3</w:t>
+        </w:r>
+      </w:hyperlink>
+      <w:r>
+        <w:t xml:space="preserve">) highlights the distribution of</w:t>
+      </w:r>
+      <w:r>
+        <w:t xml:space="preserve"> </w:t>
+      </w:r>
+      <w:r>
+        <w:t xml:space="preserve">carbonyl groups, hydrogen-bond donors and acceptors, aromatic surfaces, and</w:t>
+      </w:r>
+      <w:r>
+        <w:t xml:space="preserve"> </w:t>
+      </w:r>
+      <w:r>
+        <w:t xml:space="preserve">halogenated substituents across the series. I5K is smaller and less</w:t>
+      </w:r>
+      <w:r>
+        <w:t xml:space="preserve"> </w:t>
+      </w:r>
+      <w:r>
+        <w:t xml:space="preserve">structurally elaborate than the screened candidates. These features provided</w:t>
+      </w:r>
+      <w:r>
+        <w:t xml:space="preserve"> </w:t>
+      </w:r>
+      <w:r>
+        <w:t xml:space="preserve">chemical context for comparing hydrogen bonding, nonpolar interactions,</w:t>
+      </w:r>
+      <w:r>
+        <w:t xml:space="preserve"> </w:t>
+      </w:r>
+      <w:r>
+        <w:t xml:space="preserve">MM/GBSA components, and predicted ADMET properties; they were not treated as</w:t>
+      </w:r>
+      <w:r>
+        <w:t xml:space="preserve"> </w:t>
+      </w:r>
+      <w:r>
+        <w:t xml:space="preserve">evidence of specific protein contacts without trajectory-level confirmation.</w:t>
       </w:r>
     </w:p>
     <w:tbl>
@@ -1783,7 +1991,7 @@
       <w:tr>
         <w:tc>
           <w:tcPr/>
-          <w:bookmarkStart w:id="27" w:name="fig-selected-hits"/>
+          <w:bookmarkStart w:id="30" w:name="fig-selected-hits"/>
           <w:p>
             <w:pPr>
               <w:pStyle w:val="Compact"/>
@@ -1794,18 +2002,18 @@
                 <wp:inline>
                   <wp:extent cx="5334000" cy="2667000"/>
                   <wp:effectExtent b="0" l="0" r="0" t="0"/>
-                  <wp:docPr descr="" title="" id="25" name="Picture"/>
+                  <wp:docPr descr="" title="" id="28" name="Picture"/>
                   <a:graphic>
                     <a:graphicData uri="http://schemas.openxmlformats.org/drawingml/2006/picture">
                       <pic:pic>
                         <pic:nvPicPr>
-                          <pic:cNvPr descr="figures/058_enamine_candidates_i5k.png" id="26" name="Picture"/>
+                          <pic:cNvPr descr="figures/058_enamine_candidates_i5k.png" id="29" name="Picture"/>
                           <pic:cNvPicPr>
                             <a:picLocks noChangeArrowheads="1" noChangeAspect="1"/>
                           </pic:cNvPicPr>
                         </pic:nvPicPr>
                         <pic:blipFill>
-                          <a:blip r:embed="rId24"/>
+                          <a:blip r:embed="rId27"/>
                           <a:stretch>
                             <a:fillRect/>
                           </a:stretch>
@@ -1851,27 +2059,27 @@
               <w:t xml:space="preserve">co-crystallized reference ligand I5K.</w:t>
             </w:r>
           </w:p>
-          <w:bookmarkEnd w:id="27"/>
+          <w:bookmarkEnd w:id="30"/>
         </w:tc>
       </w:tr>
     </w:tbl>
-    <w:bookmarkEnd w:id="28"/>
-    <w:bookmarkStart w:id="41" w:name="molecular-dynamics-and-mmgbsa-analysis-1"/>
+    <w:bookmarkEnd w:id="31"/>
+    <w:bookmarkStart w:id="44" w:name="molecular-dynamics-and-mmgbsa-analysis-1"/>
     <w:p>
       <w:pPr>
         <w:pStyle w:val="Heading2"/>
       </w:pPr>
       <w:r>
-        <w:t xml:space="preserve">3.2 Molecular dynamics and MM/GBSA analysis</w:t>
-      </w:r>
-    </w:p>
-    <w:bookmarkStart w:id="33" w:name="Xdb3b8c6587acfba9cd71df29465d7b6c4cd0cae"/>
+        <w:t xml:space="preserve">4.2 Molecular dynamics and MM/GBSA analysis</w:t>
+      </w:r>
+    </w:p>
+    <w:bookmarkStart w:id="36" w:name="Xdb3b8c6587acfba9cd71df29465d7b6c4cd0cae"/>
     <w:p>
       <w:pPr>
         <w:pStyle w:val="Heading3"/>
       </w:pPr>
       <w:r>
-        <w:t xml:space="preserve">3.2.1 Structural stability and intermolecular interactions</w:t>
+        <w:t xml:space="preserve">4.2.1 Structural stability and intermolecular interactions</w:t>
       </w:r>
     </w:p>
     <w:p>
@@ -2218,7 +2426,36 @@
         </w:r>
       </w:hyperlink>
       <w:r>
-        <w:t xml:space="preserve">, panel G).</w:t>
+        <w:t xml:space="preserve">, panel G). Thus, the presence</w:t>
+      </w:r>
+      <w:r>
+        <w:t xml:space="preserve"> </w:t>
+      </w:r>
+      <w:r>
+        <w:t xml:space="preserve">of several heteroatom-containing groups in the two-dimensional structures</w:t>
+      </w:r>
+      <w:r>
+        <w:t xml:space="preserve"> </w:t>
+      </w:r>
+      <w:r>
+        <w:t xml:space="preserve">(</w:t>
+      </w:r>
+      <w:hyperlink r:id="rId26">
+        <w:r>
+          <w:rPr>
+            <w:rStyle w:val="Hyperlink"/>
+          </w:rPr>
+          <w:t xml:space="preserve">Supplementary Figure S3</w:t>
+        </w:r>
+      </w:hyperlink>
+      <w:r>
+        <w:t xml:space="preserve">) did not by itself predict</w:t>
+      </w:r>
+      <w:r>
+        <w:t xml:space="preserve"> </w:t>
+      </w:r>
+      <w:r>
+        <w:t xml:space="preserve">persistent protein–ligand hydrogen bonding.</w:t>
       </w:r>
     </w:p>
     <w:p>
@@ -2295,7 +2532,7 @@
       <w:tr>
         <w:tc>
           <w:tcPr/>
-          <w:bookmarkStart w:id="32" w:name="fig-md-stability"/>
+          <w:bookmarkStart w:id="35" w:name="fig-md-stability"/>
           <w:p>
             <w:pPr>
               <w:pStyle w:val="Compact"/>
@@ -2306,18 +2543,18 @@
                 <wp:inline>
                   <wp:extent cx="5334000" cy="7547396"/>
                   <wp:effectExtent b="0" l="0" r="0" t="0"/>
-                  <wp:docPr descr="" title="" id="30" name="Picture"/>
+                  <wp:docPr descr="" title="" id="33" name="Picture"/>
                   <a:graphic>
                     <a:graphicData uri="http://schemas.openxmlformats.org/drawingml/2006/picture">
                       <pic:pic>
                         <pic:nvPicPr>
-                          <pic:cNvPr descr="figures/pfbdp1-md-stability-interactions.jpeg" id="31" name="Picture"/>
+                          <pic:cNvPr descr="figures/pfbdp1-md-stability-interactions.jpeg" id="34" name="Picture"/>
                           <pic:cNvPicPr>
                             <a:picLocks noChangeArrowheads="1" noChangeAspect="1"/>
                           </pic:cNvPicPr>
                         </pic:nvPicPr>
                         <pic:blipFill>
-                          <a:blip r:embed="rId29"/>
+                          <a:blip r:embed="rId32"/>
                           <a:stretch>
                             <a:fillRect/>
                           </a:stretch>
@@ -2393,18 +2630,18 @@
               <w:t xml:space="preserve">simulations.</w:t>
             </w:r>
           </w:p>
-          <w:bookmarkEnd w:id="32"/>
+          <w:bookmarkEnd w:id="35"/>
         </w:tc>
       </w:tr>
     </w:tbl>
-    <w:bookmarkEnd w:id="33"/>
-    <w:bookmarkStart w:id="38" w:name="conformational-sampling"/>
+    <w:bookmarkEnd w:id="36"/>
+    <w:bookmarkStart w:id="41" w:name="conformational-sampling"/>
     <w:p>
       <w:pPr>
         <w:pStyle w:val="Heading3"/>
       </w:pPr>
       <w:r>
-        <w:t xml:space="preserve">3.2.2 Conformational sampling</w:t>
+        <w:t xml:space="preserve">4.2.2 Conformational sampling</w:t>
       </w:r>
     </w:p>
     <w:p>
@@ -2576,7 +2813,7 @@
       <w:tr>
         <w:tc>
           <w:tcPr/>
-          <w:bookmarkStart w:id="37" w:name="fig-pca-landscapes"/>
+          <w:bookmarkStart w:id="40" w:name="fig-pca-landscapes"/>
           <w:p>
             <w:pPr>
               <w:pStyle w:val="Compact"/>
@@ -2587,18 +2824,18 @@
                 <wp:inline>
                   <wp:extent cx="5266112" cy="7452359"/>
                   <wp:effectExtent b="0" l="0" r="0" t="0"/>
-                  <wp:docPr descr="" title="" id="35" name="Picture"/>
+                  <wp:docPr descr="" title="" id="38" name="Picture"/>
                   <a:graphic>
                     <a:graphicData uri="http://schemas.openxmlformats.org/drawingml/2006/picture">
                       <pic:pic>
                         <pic:nvPicPr>
-                          <pic:cNvPr descr="figures/pfbdp1-pca-free-energy-landscapes.jpeg" id="36" name="Picture"/>
+                          <pic:cNvPr descr="figures/pfbdp1-pca-free-energy-landscapes.jpeg" id="39" name="Picture"/>
                           <pic:cNvPicPr>
                             <a:picLocks noChangeArrowheads="1" noChangeAspect="1"/>
                           </pic:cNvPicPr>
                         </pic:nvPicPr>
                         <pic:blipFill>
-                          <a:blip r:embed="rId34"/>
+                          <a:blip r:embed="rId37"/>
                           <a:stretch>
                             <a:fillRect/>
                           </a:stretch>
@@ -2680,18 +2917,18 @@
               <w:t xml:space="preserve">simulations.</w:t>
             </w:r>
           </w:p>
-          <w:bookmarkEnd w:id="37"/>
+          <w:bookmarkEnd w:id="40"/>
         </w:tc>
       </w:tr>
     </w:tbl>
-    <w:bookmarkEnd w:id="38"/>
-    <w:bookmarkStart w:id="40" w:name="mmgbsa-binding-energy-estimates"/>
+    <w:bookmarkEnd w:id="41"/>
+    <w:bookmarkStart w:id="43" w:name="mmgbsa-binding-energy-estimates"/>
     <w:p>
       <w:pPr>
         <w:pStyle w:val="Heading3"/>
       </w:pPr>
       <w:r>
-        <w:t xml:space="preserve">3.2.3 MM/GBSA binding-energy estimates</w:t>
+        <w:t xml:space="preserve">4.2.3 MM/GBSA binding-energy estimates</w:t>
       </w:r>
     </w:p>
     <w:p>
@@ -2729,7 +2966,7 @@
       <w:tr>
         <w:tc>
           <w:tcPr/>
-          <w:bookmarkStart w:id="39" w:name="tbl-mmgbsa"/>
+          <w:bookmarkStart w:id="42" w:name="tbl-mmgbsa"/>
           <w:p>
             <w:pPr>
               <w:jc w:val="center"/>
@@ -3604,7 +3841,7 @@
               </w:tc>
             </w:tr>
           </w:tbl>
-          <w:bookmarkEnd w:id="39"/>
+          <w:bookmarkEnd w:id="42"/>
           <w:p/>
         </w:tc>
       </w:tr>
@@ -3779,25 +4016,60 @@
         <w:t xml:space="preserve"> </w:t>
       </w:r>
       <w:r>
-        <w:t xml:space="preserve">that of I5K under the present model. Across the single-trajectory descriptors,</w:t>
-      </w:r>
-      <w:r>
-        <w:t xml:space="preserve"> </w:t>
-      </w:r>
-      <w:r>
-        <w:t xml:space="preserve">Z985612796 therefore showed the most consistent binding profile. These values</w:t>
-      </w:r>
-      <w:r>
-        <w:t xml:space="preserve"> </w:t>
-      </w:r>
-      <w:r>
-        <w:t xml:space="preserve">should be interpreted as model-dependent endpoint energy estimates rather</w:t>
-      </w:r>
-      <w:r>
-        <w:t xml:space="preserve"> </w:t>
-      </w:r>
-      <w:r>
-        <w:t xml:space="preserve">than experimental binding free energies (</w:t>
+        <w:t xml:space="preserve">that of I5K under the present model. Its extended aromatic surface and polar</w:t>
+      </w:r>
+      <w:r>
+        <w:t xml:space="preserve"> </w:t>
+      </w:r>
+      <w:r>
+        <w:t xml:space="preserve">groups (</w:t>
+      </w:r>
+      <w:hyperlink r:id="rId26">
+        <w:r>
+          <w:rPr>
+            <w:rStyle w:val="Hyperlink"/>
+          </w:rPr>
+          <w:t xml:space="preserve">Supplementary Figure S3</w:t>
+        </w:r>
+      </w:hyperlink>
+      <w:r>
+        <w:t xml:space="preserve">) are chemically consistent</w:t>
+      </w:r>
+      <w:r>
+        <w:t xml:space="preserve"> </w:t>
+      </w:r>
+      <w:r>
+        <w:t xml:space="preserve">with opportunities for nonpolar and electrostatic interactions, respectively,</w:t>
+      </w:r>
+      <w:r>
+        <w:t xml:space="preserve"> </w:t>
+      </w:r>
+      <w:r>
+        <w:t xml:space="preserve">but atom-level energy decomposition would be required to assign individual</w:t>
+      </w:r>
+      <w:r>
+        <w:t xml:space="preserve"> </w:t>
+      </w:r>
+      <w:r>
+        <w:t xml:space="preserve">group contributions. Across the single-trajectory descriptors, Z985612796</w:t>
+      </w:r>
+      <w:r>
+        <w:t xml:space="preserve"> </w:t>
+      </w:r>
+      <w:r>
+        <w:t xml:space="preserve">therefore showed the most consistent binding profile. These values should be</w:t>
+      </w:r>
+      <w:r>
+        <w:t xml:space="preserve"> </w:t>
+      </w:r>
+      <w:r>
+        <w:t xml:space="preserve">interpreted as model-dependent endpoint energy estimates rather than</w:t>
+      </w:r>
+      <w:r>
+        <w:t xml:space="preserve"> </w:t>
+      </w:r>
+      <w:r>
+        <w:t xml:space="preserve">experimental binding free energies (</w:t>
       </w:r>
       <w:hyperlink w:anchor="tbl-mmgbsa">
         <w:r>
@@ -3811,15 +4083,15 @@
         <w:t xml:space="preserve">).</w:t>
       </w:r>
     </w:p>
-    <w:bookmarkEnd w:id="40"/>
-    <w:bookmarkEnd w:id="41"/>
-    <w:bookmarkStart w:id="42" w:name="X85299cc7c2f9fb62910d909b131ab350587d560"/>
+    <w:bookmarkEnd w:id="43"/>
+    <w:bookmarkEnd w:id="44"/>
+    <w:bookmarkStart w:id="45" w:name="X85299cc7c2f9fb62910d909b131ab350587d560"/>
     <w:p>
       <w:pPr>
         <w:pStyle w:val="Heading2"/>
       </w:pPr>
       <w:r>
-        <w:t xml:space="preserve">3.3 Predicted physicochemical and ADMET profiles</w:t>
+        <w:t xml:space="preserve">4.3 Predicted physicochemical and ADMET profiles</w:t>
       </w:r>
     </w:p>
     <w:p>
@@ -4014,30 +4286,6 @@
         <w:pStyle w:val="BodyText"/>
       </w:pPr>
       <w:r>
-        <w:t xml:space="preserve">I5K had the most favorable molecular weight (254.3 Da), QED (0.604), and</w:t>
-      </w:r>
-      <w:r>
-        <w:t xml:space="preserve"> </w:t>
-      </w:r>
-      <w:r>
-        <w:t xml:space="preserve">predicted solubility (logS −3.34). However, its AMES probability was 0.726,</w:t>
-      </w:r>
-      <w:r>
-        <w:t xml:space="preserve"> </w:t>
-      </w:r>
-      <w:r>
-        <w:t xml:space="preserve">and CYP1A2, CYP2C19, CYP2C9, and CYP3A4 probabilities were 0.647–0.995.</w:t>
-      </w:r>
-      <w:r>
-        <w:t xml:space="preserve"> </w:t>
-      </w:r>
-      <w:r>
-        <w:t xml:space="preserve">Thus, I5K served as a binding reference rather than a safety benchmark.</w:t>
-      </w:r>
-      <w:r>
-        <w:t xml:space="preserve"> </w:t>
-      </w:r>
-      <w:r>
         <w:t xml:space="preserve">Across the predicted profile, Z1723441401 provided the most balanced</w:t>
       </w:r>
       <w:r>
@@ -4103,7 +4351,7 @@
         </w:r>
       </w:hyperlink>
       <w:r>
-        <w:t xml:space="preserve">). Z985612796 led the MD/MM/GBSA</w:t>
+        <w:t xml:space="preserve">). Z985612796 ranked highest in the MD/MM/GBSA</w:t>
       </w:r>
       <w:r>
         <w:t xml:space="preserve"> </w:t>
@@ -4142,14 +4390,14 @@
         <w:t xml:space="preserve">estimates alone.</w:t>
       </w:r>
     </w:p>
-    <w:bookmarkEnd w:id="42"/>
-    <w:bookmarkStart w:id="43" w:name="study-limitations-and-next-steps"/>
+    <w:bookmarkEnd w:id="45"/>
+    <w:bookmarkStart w:id="46" w:name="study-limitations-and-next-steps"/>
     <w:p>
       <w:pPr>
         <w:pStyle w:val="Heading2"/>
       </w:pPr>
       <w:r>
-        <w:t xml:space="preserve">3.4 Study limitations and next steps</w:t>
+        <w:t xml:space="preserve">4.4 Study limitations and next steps</w:t>
       </w:r>
     </w:p>
     <w:p>
@@ -4234,15 +4482,15 @@
         <w:t xml:space="preserve">I5K or the other candidates.</w:t>
       </w:r>
     </w:p>
-    <w:bookmarkEnd w:id="43"/>
-    <w:bookmarkEnd w:id="44"/>
-    <w:bookmarkStart w:id="45" w:name="conclusion"/>
+    <w:bookmarkEnd w:id="46"/>
+    <w:bookmarkEnd w:id="47"/>
+    <w:bookmarkStart w:id="48" w:name="conclusion"/>
     <w:p>
       <w:pPr>
         <w:pStyle w:val="Heading1"/>
       </w:pPr>
       <w:r>
-        <w:t xml:space="preserve">4. Conclusion</w:t>
+        <w:t xml:space="preserve">5. Conclusion</w:t>
       </w:r>
     </w:p>
     <w:p>
@@ -4262,7 +4510,7 @@
         <w:t xml:space="preserve"> </w:t>
       </w:r>
       <w:r>
-        <w:t xml:space="preserve">prioritize five candidates. Z985612796 emerged as the lead computational</w:t>
+        <w:t xml:space="preserve">prioritize five candidates. Z985612796 emerged as the computationally prioritized</w:t>
       </w:r>
       <w:r>
         <w:t xml:space="preserve"> </w:t>
@@ -4334,17 +4582,35 @@
         <w:t xml:space="preserve"> </w:t>
       </w:r>
       <w:r>
-        <w:t xml:space="preserve">as a PfBDP1-directed antimalarial lead.</w:t>
-      </w:r>
-    </w:p>
-    <w:bookmarkEnd w:id="45"/>
-    <w:bookmarkStart w:id="109" w:name="supplementary-data"/>
+        <w:t xml:space="preserve">as a PfBDP1-directed antimalarial candidate.</w:t>
+      </w:r>
+    </w:p>
+    <w:bookmarkEnd w:id="48"/>
+    <w:bookmarkStart w:id="49" w:name="acknowledgments"/>
     <w:p>
       <w:pPr>
         <w:pStyle w:val="Heading1"/>
       </w:pPr>
       <w:r>
-        <w:t xml:space="preserve">5. Supplementary Data</w:t>
+        <w:t xml:space="preserve">6. Acknowledgments</w:t>
+      </w:r>
+    </w:p>
+    <w:p>
+      <w:pPr>
+        <w:pStyle w:val="FirstParagraph"/>
+      </w:pPr>
+      <w:r>
+        <w:t xml:space="preserve">This research was funded in whole or in part by Science for Africa Foundation to DELGEME Plus Del-22-013 with support from Wellcome Trust and the UK Foreign, Commonwealth &amp; Development Office and is part of the EDCTP 2 programme supported by the European Union. For purposes of open access, the author has applied a CC BY public copyright licence to any Author Accepted Manuscript version arising from this submission.</w:t>
+      </w:r>
+    </w:p>
+    <w:bookmarkEnd w:id="49"/>
+    <w:bookmarkStart w:id="115" w:name="supplementary-data"/>
+    <w:p>
+      <w:pPr>
+        <w:pStyle w:val="Heading1"/>
+      </w:pPr>
+      <w:r>
+        <w:t xml:space="preserve">7. Supplementary Data</w:t>
       </w:r>
     </w:p>
     <w:tbl>
@@ -4360,7 +4626,7 @@
       <w:tr>
         <w:tc>
           <w:tcPr/>
-          <w:bookmarkStart w:id="46" w:name="dat-screening-results"/>
+          <w:bookmarkStart w:id="50" w:name="dat-screening-results"/>
           <w:p>
             <w:pPr>
               <w:jc w:val="center"/>
@@ -4386,7 +4652,7 @@
               <w:t xml:space="preserve">binding estimates.</w:t>
             </w:r>
           </w:p>
-          <w:bookmarkEnd w:id="46"/>
+          <w:bookmarkEnd w:id="50"/>
         </w:tc>
       </w:tr>
     </w:tbl>
@@ -4411,7 +4677,7 @@
       <w:tr>
         <w:tc>
           <w:tcPr/>
-          <w:bookmarkStart w:id="47" w:name="dat-admet-profiles"/>
+          <w:bookmarkStart w:id="51" w:name="dat-admet-profiles"/>
           <w:p>
             <w:pPr>
               <w:jc w:val="center"/>
@@ -4431,12 +4697,12 @@
               <w:t xml:space="preserve">five Enamine candidates and the co-crystallized reference ligand I5K.</w:t>
             </w:r>
           </w:p>
-          <w:bookmarkEnd w:id="47"/>
+          <w:bookmarkEnd w:id="51"/>
         </w:tc>
       </w:tr>
     </w:tbl>
-    <w:bookmarkStart w:id="108" w:name="refs"/>
-    <w:bookmarkStart w:id="49" w:name="ref-abrahamGROMACSHighPerformance2015"/>
+    <w:bookmarkStart w:id="114" w:name="refs"/>
+    <w:bookmarkStart w:id="53" w:name="ref-abrahamGROMACSHighPerformance2015"/>
     <w:p>
       <w:pPr>
         <w:pStyle w:val="Bibliography"/>
@@ -4487,7 +4753,7 @@
       <w:r>
         <w:t xml:space="preserve"> </w:t>
       </w:r>
-      <w:hyperlink r:id="rId48">
+      <w:hyperlink r:id="rId52">
         <w:r>
           <w:rPr>
             <w:rStyle w:val="Hyperlink"/>
@@ -4499,8 +4765,8 @@
         <w:t xml:space="preserve">.</w:t>
       </w:r>
     </w:p>
-    <w:bookmarkEnd w:id="49"/>
-    <w:bookmarkStart w:id="51" w:name="Xe6616dd3440a01982bea3a01ea7030aa530a08c"/>
+    <w:bookmarkEnd w:id="53"/>
+    <w:bookmarkStart w:id="55" w:name="Xe6616dd3440a01982bea3a01ea7030aa530a08c"/>
     <w:p>
       <w:pPr>
         <w:pStyle w:val="Bibliography"/>
@@ -4557,7 +4823,7 @@
       <w:r>
         <w:t xml:space="preserve"> </w:t>
       </w:r>
-      <w:hyperlink r:id="rId50">
+      <w:hyperlink r:id="rId54">
         <w:r>
           <w:rPr>
             <w:rStyle w:val="Hyperlink"/>
@@ -4569,8 +4835,8 @@
         <w:t xml:space="preserve">.</w:t>
       </w:r>
     </w:p>
-    <w:bookmarkEnd w:id="51"/>
-    <w:bookmarkStart w:id="53" w:name="ref-amannNovelInhibitorBromodomain2025"/>
+    <w:bookmarkEnd w:id="55"/>
+    <w:bookmarkStart w:id="57" w:name="ref-amannNovelInhibitorBromodomain2025"/>
     <w:p>
       <w:pPr>
         <w:pStyle w:val="Bibliography"/>
@@ -4646,7 +4912,7 @@
       <w:r>
         <w:t xml:space="preserve"> </w:t>
       </w:r>
-      <w:hyperlink r:id="rId52">
+      <w:hyperlink r:id="rId56">
         <w:r>
           <w:rPr>
             <w:rStyle w:val="Hyperlink"/>
@@ -4658,8 +4924,8 @@
         <w:t xml:space="preserve">.</w:t>
       </w:r>
     </w:p>
-    <w:bookmarkEnd w:id="53"/>
-    <w:bookmarkStart w:id="55" w:name="ref-amann2024"/>
+    <w:bookmarkEnd w:id="57"/>
+    <w:bookmarkStart w:id="59" w:name="ref-amann2024"/>
     <w:p>
       <w:pPr>
         <w:pStyle w:val="Bibliography"/>
@@ -4683,7 +4949,7 @@
       <w:r>
         <w:t xml:space="preserve"> </w:t>
       </w:r>
-      <w:hyperlink r:id="rId54">
+      <w:hyperlink r:id="rId58">
         <w:r>
           <w:rPr>
             <w:rStyle w:val="Hyperlink"/>
@@ -4695,8 +4961,8 @@
         <w:t xml:space="preserve">.</w:t>
       </w:r>
     </w:p>
-    <w:bookmarkEnd w:id="55"/>
-    <w:bookmarkStart w:id="57" w:name="ref-Armstrong2023MalariaPharm"/>
+    <w:bookmarkEnd w:id="59"/>
+    <w:bookmarkStart w:id="61" w:name="ref-Armstrong2023MalariaPharm"/>
     <w:p>
       <w:pPr>
         <w:pStyle w:val="Bibliography"/>
@@ -4750,7 +5016,7 @@
       <w:r>
         <w:t xml:space="preserve"> </w:t>
       </w:r>
-      <w:hyperlink r:id="rId56">
+      <w:hyperlink r:id="rId60">
         <w:r>
           <w:rPr>
             <w:rStyle w:val="Hyperlink"/>
@@ -4762,8 +5028,54 @@
         <w:t xml:space="preserve">.</w:t>
       </w:r>
     </w:p>
-    <w:bookmarkEnd w:id="57"/>
-    <w:bookmarkStart w:id="58" w:name="ref-Blasco2017"/>
+    <w:bookmarkEnd w:id="61"/>
+    <w:bookmarkStart w:id="63" w:name="ref-Bickerton2012"/>
+    <w:p>
+      <w:pPr>
+        <w:pStyle w:val="Bibliography"/>
+      </w:pPr>
+      <w:r>
+        <w:t xml:space="preserve">Bickerton, G. Richard, Gaia V. Paolini, Jérémy Besnard, Sorel Muresan, and Andrew L. Hopkins. 2012.</w:t>
+      </w:r>
+      <w:r>
+        <w:t xml:space="preserve"> </w:t>
+      </w:r>
+      <w:r>
+        <w:t xml:space="preserve">“Quantifying the Chemical Beauty of Drugs.”</w:t>
+      </w:r>
+      <w:r>
+        <w:t xml:space="preserve"> </w:t>
+      </w:r>
+      <w:r>
+        <w:rPr>
+          <w:i/>
+          <w:iCs/>
+        </w:rPr>
+        <w:t xml:space="preserve">Nature Chemistry</w:t>
+      </w:r>
+      <w:r>
+        <w:t xml:space="preserve"> </w:t>
+      </w:r>
+      <w:r>
+        <w:t xml:space="preserve">4 (2): 90–98.</w:t>
+      </w:r>
+      <w:r>
+        <w:t xml:space="preserve"> </w:t>
+      </w:r>
+      <w:hyperlink r:id="rId62">
+        <w:r>
+          <w:rPr>
+            <w:rStyle w:val="Hyperlink"/>
+          </w:rPr>
+          <w:t xml:space="preserve">https://doi.org/10.1038/nchem.1243</w:t>
+        </w:r>
+      </w:hyperlink>
+      <w:r>
+        <w:t xml:space="preserve">.</w:t>
+      </w:r>
+    </w:p>
+    <w:bookmarkEnd w:id="63"/>
+    <w:bookmarkStart w:id="64" w:name="ref-Blasco2017"/>
     <w:p>
       <w:pPr>
         <w:pStyle w:val="Bibliography"/>
@@ -4794,8 +5106,8 @@
         <w:t xml:space="preserve">23 (8): 917–28.</w:t>
       </w:r>
     </w:p>
-    <w:bookmarkEnd w:id="58"/>
-    <w:bookmarkStart w:id="60" w:name="ref-jnNewDevelopmentsAntimalarial2017"/>
+    <w:bookmarkEnd w:id="64"/>
+    <w:bookmarkStart w:id="66" w:name="ref-jnNewDevelopmentsAntimalarial2017"/>
     <w:p>
       <w:pPr>
         <w:pStyle w:val="Bibliography"/>
@@ -4828,7 +5140,7 @@
       <w:r>
         <w:t xml:space="preserve"> </w:t>
       </w:r>
-      <w:hyperlink r:id="rId59">
+      <w:hyperlink r:id="rId65">
         <w:r>
           <w:rPr>
             <w:rStyle w:val="Hyperlink"/>
@@ -4840,8 +5152,8 @@
         <w:t xml:space="preserve">.</w:t>
       </w:r>
     </w:p>
-    <w:bookmarkEnd w:id="60"/>
-    <w:bookmarkStart w:id="62" w:name="ref-Burrows2013TCP"/>
+    <w:bookmarkEnd w:id="66"/>
+    <w:bookmarkStart w:id="68" w:name="ref-Burrows2013TCP"/>
     <w:p>
       <w:pPr>
         <w:pStyle w:val="Bibliography"/>
@@ -4874,7 +5186,7 @@
       <w:r>
         <w:t xml:space="preserve"> </w:t>
       </w:r>
-      <w:hyperlink r:id="rId61">
+      <w:hyperlink r:id="rId67">
         <w:r>
           <w:rPr>
             <w:rStyle w:val="Hyperlink"/>
@@ -4886,8 +5198,8 @@
         <w:t xml:space="preserve">.</w:t>
       </w:r>
     </w:p>
-    <w:bookmarkEnd w:id="62"/>
-    <w:bookmarkStart w:id="64" w:name="ref-bussiCanonicalSamplingVelocity2007"/>
+    <w:bookmarkEnd w:id="68"/>
+    <w:bookmarkStart w:id="70" w:name="ref-bussiCanonicalSamplingVelocity2007"/>
     <w:p>
       <w:pPr>
         <w:pStyle w:val="Bibliography"/>
@@ -4920,7 +5232,7 @@
       <w:r>
         <w:t xml:space="preserve"> </w:t>
       </w:r>
-      <w:hyperlink r:id="rId63">
+      <w:hyperlink r:id="rId69">
         <w:r>
           <w:rPr>
             <w:rStyle w:val="Hyperlink"/>
@@ -4932,8 +5244,8 @@
         <w:t xml:space="preserve">.</w:t>
       </w:r>
     </w:p>
-    <w:bookmarkEnd w:id="64"/>
-    <w:bookmarkStart w:id="65" w:name="ref-buttenschoen2024posebusters"/>
+    <w:bookmarkEnd w:id="70"/>
+    <w:bookmarkStart w:id="71" w:name="ref-buttenschoen2024posebusters"/>
     <w:p>
       <w:pPr>
         <w:pStyle w:val="Bibliography"/>
@@ -4964,8 +5276,8 @@
         <w:t xml:space="preserve">15 (9): 3130–39.</w:t>
       </w:r>
     </w:p>
-    <w:bookmarkEnd w:id="65"/>
-    <w:bookmarkStart w:id="67" w:name="ref-compound"/>
+    <w:bookmarkEnd w:id="71"/>
+    <w:bookmarkStart w:id="73" w:name="ref-compound"/>
     <w:p>
       <w:pPr>
         <w:pStyle w:val="Bibliography"/>
@@ -4983,7 +5295,7 @@
       <w:r>
         <w:t xml:space="preserve"> </w:t>
       </w:r>
-      <w:hyperlink r:id="rId66">
+      <w:hyperlink r:id="rId72">
         <w:r>
           <w:rPr>
             <w:rStyle w:val="Hyperlink"/>
@@ -4995,8 +5307,8 @@
         <w:t xml:space="preserve">.</w:t>
       </w:r>
     </w:p>
-    <w:bookmarkEnd w:id="67"/>
-    <w:bookmarkStart w:id="69" w:name="ref-dardenParticleMeshEwald1993"/>
+    <w:bookmarkEnd w:id="73"/>
+    <w:bookmarkStart w:id="75" w:name="ref-dardenParticleMeshEwald1993"/>
     <w:p>
       <w:pPr>
         <w:pStyle w:val="Bibliography"/>
@@ -5073,7 +5385,7 @@
       <w:r>
         <w:t xml:space="preserve"> </w:t>
       </w:r>
-      <w:hyperlink r:id="rId68">
+      <w:hyperlink r:id="rId74">
         <w:r>
           <w:rPr>
             <w:rStyle w:val="Hyperlink"/>
@@ -5085,8 +5397,8 @@
         <w:t xml:space="preserve">.</w:t>
       </w:r>
     </w:p>
-    <w:bookmarkEnd w:id="69"/>
-    <w:bookmarkStart w:id="71" w:name="ref-eastman2017"/>
+    <w:bookmarkEnd w:id="75"/>
+    <w:bookmarkStart w:id="77" w:name="ref-eastman2017"/>
     <w:p>
       <w:pPr>
         <w:pStyle w:val="Bibliography"/>
@@ -5119,7 +5431,7 @@
       <w:r>
         <w:t xml:space="preserve"> </w:t>
       </w:r>
-      <w:hyperlink r:id="rId70">
+      <w:hyperlink r:id="rId76">
         <w:r>
           <w:rPr>
             <w:rStyle w:val="Hyperlink"/>
@@ -5131,8 +5443,8 @@
         <w:t xml:space="preserve">.</w:t>
       </w:r>
     </w:p>
-    <w:bookmarkEnd w:id="71"/>
-    <w:bookmarkStart w:id="73" w:name="ref-Godara2024MultiKinaseVS"/>
+    <w:bookmarkEnd w:id="77"/>
+    <w:bookmarkStart w:id="79" w:name="ref-Godara2024MultiKinaseVS"/>
     <w:p>
       <w:pPr>
         <w:pStyle w:val="Bibliography"/>
@@ -5177,7 +5489,7 @@
       <w:r>
         <w:t xml:space="preserve"> </w:t>
       </w:r>
-      <w:hyperlink r:id="rId72">
+      <w:hyperlink r:id="rId78">
         <w:r>
           <w:rPr>
             <w:rStyle w:val="Hyperlink"/>
@@ -5189,8 +5501,8 @@
         <w:t xml:space="preserve">.</w:t>
       </w:r>
     </w:p>
-    <w:bookmarkEnd w:id="73"/>
-    <w:bookmarkStart w:id="75" w:name="ref-grygorenko2021"/>
+    <w:bookmarkEnd w:id="79"/>
+    <w:bookmarkStart w:id="81" w:name="ref-grygorenko2021"/>
     <w:p>
       <w:pPr>
         <w:pStyle w:val="Bibliography"/>
@@ -5223,7 +5535,7 @@
       <w:r>
         <w:t xml:space="preserve"> </w:t>
       </w:r>
-      <w:hyperlink r:id="rId74">
+      <w:hyperlink r:id="rId80">
         <w:r>
           <w:rPr>
             <w:rStyle w:val="Hyperlink"/>
@@ -5235,8 +5547,8 @@
         <w:t xml:space="preserve">.</w:t>
       </w:r>
     </w:p>
-    <w:bookmarkEnd w:id="75"/>
-    <w:bookmarkStart w:id="77" w:name="ref-hessLINCSLinearConstraint1997"/>
+    <w:bookmarkEnd w:id="81"/>
+    <w:bookmarkStart w:id="83" w:name="ref-hessLINCSLinearConstraint1997"/>
     <w:p>
       <w:pPr>
         <w:pStyle w:val="Bibliography"/>
@@ -5287,7 +5599,7 @@
       <w:r>
         <w:t xml:space="preserve"> </w:t>
       </w:r>
-      <w:hyperlink r:id="rId76">
+      <w:hyperlink r:id="rId82">
         <w:r>
           <w:rPr>
             <w:rStyle w:val="Hyperlink"/>
@@ -5299,8 +5611,8 @@
         <w:t xml:space="preserve">.</w:t>
       </w:r>
     </w:p>
-    <w:bookmarkEnd w:id="77"/>
-    <w:bookmarkStart w:id="79" w:name="ref-huangCHARMM36AllatomAdditive2013"/>
+    <w:bookmarkEnd w:id="83"/>
+    <w:bookmarkStart w:id="85" w:name="ref-huangCHARMM36AllatomAdditive2013"/>
     <w:p>
       <w:pPr>
         <w:pStyle w:val="Bibliography"/>
@@ -5366,7 +5678,7 @@
       <w:r>
         <w:t xml:space="preserve"> </w:t>
       </w:r>
-      <w:hyperlink r:id="rId78">
+      <w:hyperlink r:id="rId84">
         <w:r>
           <w:rPr>
             <w:rStyle w:val="Hyperlink"/>
@@ -5378,8 +5690,8 @@
         <w:t xml:space="preserve">.</w:t>
       </w:r>
     </w:p>
-    <w:bookmarkEnd w:id="79"/>
-    <w:bookmarkStart w:id="81" w:name="ref-josling2015"/>
+    <w:bookmarkEnd w:id="85"/>
+    <w:bookmarkStart w:id="87" w:name="ref-josling2015"/>
     <w:p>
       <w:pPr>
         <w:pStyle w:val="Bibliography"/>
@@ -5412,7 +5724,7 @@
       <w:r>
         <w:t xml:space="preserve"> </w:t>
       </w:r>
-      <w:hyperlink r:id="rId80">
+      <w:hyperlink r:id="rId86">
         <w:r>
           <w:rPr>
             <w:rStyle w:val="Hyperlink"/>
@@ -5424,8 +5736,8 @@
         <w:t xml:space="preserve">.</w:t>
       </w:r>
     </w:p>
-    <w:bookmarkEnd w:id="81"/>
-    <w:bookmarkStart w:id="83" w:name="ref-laboratory2026"/>
+    <w:bookmarkEnd w:id="87"/>
+    <w:bookmarkStart w:id="89" w:name="ref-laboratory2026"/>
     <w:p>
       <w:pPr>
         <w:pStyle w:val="Bibliography"/>
@@ -5449,7 +5761,7 @@
       <w:r>
         <w:t xml:space="preserve"> </w:t>
       </w:r>
-      <w:hyperlink r:id="rId82">
+      <w:hyperlink r:id="rId88">
         <w:r>
           <w:rPr>
             <w:rStyle w:val="Hyperlink"/>
@@ -5461,8 +5773,8 @@
         <w:t xml:space="preserve">.</w:t>
       </w:r>
     </w:p>
-    <w:bookmarkEnd w:id="83"/>
-    <w:bookmarkStart w:id="85" w:name="ref-greglandrum2026"/>
+    <w:bookmarkEnd w:id="89"/>
+    <w:bookmarkStart w:id="91" w:name="ref-greglandrum2026"/>
     <w:p>
       <w:pPr>
         <w:pStyle w:val="Bibliography"/>
@@ -5524,7 +5836,7 @@
       <w:r>
         <w:t xml:space="preserve"> </w:t>
       </w:r>
-      <w:hyperlink r:id="rId84">
+      <w:hyperlink r:id="rId90">
         <w:r>
           <w:rPr>
             <w:rStyle w:val="Hyperlink"/>
@@ -5536,8 +5848,8 @@
         <w:t xml:space="preserve">.</w:t>
       </w:r>
     </w:p>
-    <w:bookmarkEnd w:id="85"/>
-    <w:bookmarkStart w:id="86" w:name="ref-lipinski1997experimental"/>
+    <w:bookmarkEnd w:id="91"/>
+    <w:bookmarkStart w:id="92" w:name="ref-lipinski1997experimental"/>
     <w:p>
       <w:pPr>
         <w:pStyle w:val="Bibliography"/>
@@ -5568,8 +5880,8 @@
         <w:t xml:space="preserve">23 (1-3): 3–25.</w:t>
       </w:r>
     </w:p>
-    <w:bookmarkEnd w:id="86"/>
-    <w:bookmarkStart w:id="88" w:name="X781048b305df366de2a6aae7461ec5b0e46b13f"/>
+    <w:bookmarkEnd w:id="92"/>
+    <w:bookmarkStart w:id="94" w:name="X781048b305df366de2a6aae7461ec5b0e46b13f"/>
     <w:p>
       <w:pPr>
         <w:pStyle w:val="Bibliography"/>
@@ -5631,7 +5943,7 @@
       <w:r>
         <w:t xml:space="preserve"> </w:t>
       </w:r>
-      <w:hyperlink r:id="rId87">
+      <w:hyperlink r:id="rId93">
         <w:r>
           <w:rPr>
             <w:rStyle w:val="Hyperlink"/>
@@ -5643,8 +5955,8 @@
         <w:t xml:space="preserve">.</w:t>
       </w:r>
     </w:p>
-    <w:bookmarkEnd w:id="88"/>
-    <w:bookmarkStart w:id="90" w:name="ref-OBoyle2011"/>
+    <w:bookmarkEnd w:id="94"/>
+    <w:bookmarkStart w:id="96" w:name="ref-OBoyle2011"/>
     <w:p>
       <w:pPr>
         <w:pStyle w:val="Bibliography"/>
@@ -5677,7 +5989,7 @@
       <w:r>
         <w:t xml:space="preserve"> </w:t>
       </w:r>
-      <w:hyperlink r:id="rId89">
+      <w:hyperlink r:id="rId95">
         <w:r>
           <w:rPr>
             <w:rStyle w:val="Hyperlink"/>
@@ -5689,8 +6001,8 @@
         <w:t xml:space="preserve">.</w:t>
       </w:r>
     </w:p>
-    <w:bookmarkEnd w:id="90"/>
-    <w:bookmarkStart w:id="92" w:name="ref-osg2006"/>
+    <w:bookmarkEnd w:id="96"/>
+    <w:bookmarkStart w:id="98" w:name="ref-osg2006"/>
     <w:p>
       <w:pPr>
         <w:pStyle w:val="Bibliography"/>
@@ -5714,7 +6026,7 @@
       <w:r>
         <w:t xml:space="preserve"> </w:t>
       </w:r>
-      <w:hyperlink r:id="rId91">
+      <w:hyperlink r:id="rId97">
         <w:r>
           <w:rPr>
             <w:rStyle w:val="Hyperlink"/>
@@ -5726,8 +6038,8 @@
         <w:t xml:space="preserve">.</w:t>
       </w:r>
     </w:p>
-    <w:bookmarkEnd w:id="92"/>
-    <w:bookmarkStart w:id="94" w:name="X7e7666b4982a28a7379c697b2057d381c2e1bb2"/>
+    <w:bookmarkEnd w:id="98"/>
+    <w:bookmarkStart w:id="100" w:name="X7e7666b4982a28a7379c697b2057d381c2e1bb2"/>
     <w:p>
       <w:pPr>
         <w:pStyle w:val="Bibliography"/>
@@ -5772,7 +6084,7 @@
       <w:r>
         <w:t xml:space="preserve"> </w:t>
       </w:r>
-      <w:hyperlink r:id="rId93">
+      <w:hyperlink r:id="rId99">
         <w:r>
           <w:rPr>
             <w:rStyle w:val="Hyperlink"/>
@@ -5784,8 +6096,8 @@
         <w:t xml:space="preserve">.</w:t>
       </w:r>
     </w:p>
-    <w:bookmarkEnd w:id="94"/>
-    <w:bookmarkStart w:id="96" w:name="ref-santos-martins2025"/>
+    <w:bookmarkEnd w:id="100"/>
+    <w:bookmarkStart w:id="102" w:name="ref-santos-martins2025"/>
     <w:p>
       <w:pPr>
         <w:pStyle w:val="Bibliography"/>
@@ -5818,7 +6130,7 @@
       <w:r>
         <w:t xml:space="preserve"> </w:t>
       </w:r>
-      <w:hyperlink r:id="rId95">
+      <w:hyperlink r:id="rId101">
         <w:r>
           <w:rPr>
             <w:rStyle w:val="Hyperlink"/>
@@ -5830,8 +6142,8 @@
         <w:t xml:space="preserve">.</w:t>
       </w:r>
     </w:p>
-    <w:bookmarkEnd w:id="96"/>
-    <w:bookmarkStart w:id="98" w:name="ref-swansonADMETAIMachineLearning2024"/>
+    <w:bookmarkEnd w:id="102"/>
+    <w:bookmarkStart w:id="104" w:name="ref-swansonADMETAIMachineLearning2024"/>
     <w:p>
       <w:pPr>
         <w:pStyle w:val="Bibliography"/>
@@ -5882,7 +6194,7 @@
       <w:r>
         <w:t xml:space="preserve"> </w:t>
       </w:r>
-      <w:hyperlink r:id="rId97">
+      <w:hyperlink r:id="rId103">
         <w:r>
           <w:rPr>
             <w:rStyle w:val="Hyperlink"/>
@@ -5894,8 +6206,8 @@
         <w:t xml:space="preserve">.</w:t>
       </w:r>
     </w:p>
-    <w:bookmarkEnd w:id="98"/>
-    <w:bookmarkStart w:id="99" w:name="ref-SwissParamFastForce"/>
+    <w:bookmarkEnd w:id="104"/>
+    <w:bookmarkStart w:id="105" w:name="ref-SwissParamFastForce"/>
     <w:p>
       <w:pPr>
         <w:pStyle w:val="Bibliography"/>
@@ -6044,8 +6356,8 @@
         <w:t xml:space="preserve">. n.d. Https://onlinelibrary.wiley.com/doi/abs/10.1002/jcc.21816.</w:t>
       </w:r>
     </w:p>
-    <w:bookmarkEnd w:id="99"/>
-    <w:bookmarkStart w:id="101" w:name="ref-Trott2010"/>
+    <w:bookmarkEnd w:id="105"/>
+    <w:bookmarkStart w:id="107" w:name="ref-Trott2010"/>
     <w:p>
       <w:pPr>
         <w:pStyle w:val="Bibliography"/>
@@ -6078,7 +6390,7 @@
       <w:r>
         <w:t xml:space="preserve"> </w:t>
       </w:r>
-      <w:hyperlink r:id="rId100">
+      <w:hyperlink r:id="rId106">
         <w:r>
           <w:rPr>
             <w:rStyle w:val="Hyperlink"/>
@@ -6090,8 +6402,8 @@
         <w:t xml:space="preserve">.</w:t>
       </w:r>
     </w:p>
-    <w:bookmarkEnd w:id="101"/>
-    <w:bookmarkStart w:id="103" w:name="ref-valdes-tresancoGmx_MMPBSANewTool2021"/>
+    <w:bookmarkEnd w:id="107"/>
+    <w:bookmarkStart w:id="109" w:name="ref-valdes-tresancoGmx_MMPBSANewTool2021"/>
     <w:p>
       <w:pPr>
         <w:pStyle w:val="Bibliography"/>
@@ -6163,7 +6475,7 @@
       <w:r>
         <w:t xml:space="preserve"> </w:t>
       </w:r>
-      <w:hyperlink r:id="rId102">
+      <w:hyperlink r:id="rId108">
         <w:r>
           <w:rPr>
             <w:rStyle w:val="Hyperlink"/>
@@ -6175,8 +6487,8 @@
         <w:t xml:space="preserve">.</w:t>
       </w:r>
     </w:p>
-    <w:bookmarkEnd w:id="103"/>
-    <w:bookmarkStart w:id="105" w:name="ref-word1999"/>
+    <w:bookmarkEnd w:id="109"/>
+    <w:bookmarkStart w:id="111" w:name="ref-word1999"/>
     <w:p>
       <w:pPr>
         <w:pStyle w:val="Bibliography"/>
@@ -6209,7 +6521,7 @@
       <w:r>
         <w:t xml:space="preserve"> </w:t>
       </w:r>
-      <w:hyperlink r:id="rId104">
+      <w:hyperlink r:id="rId110">
         <w:r>
           <w:rPr>
             <w:rStyle w:val="Hyperlink"/>
@@ -6221,8 +6533,8 @@
         <w:t xml:space="preserve">.</w:t>
       </w:r>
     </w:p>
-    <w:bookmarkEnd w:id="105"/>
-    <w:bookmarkStart w:id="107" w:name="ref-WHO2025Malaria"/>
+    <w:bookmarkEnd w:id="111"/>
+    <w:bookmarkStart w:id="113" w:name="ref-WHO2025Malaria"/>
     <w:p>
       <w:pPr>
         <w:pStyle w:val="Bibliography"/>
@@ -6246,7 +6558,7 @@
       <w:r>
         <w:t xml:space="preserve"> </w:t>
       </w:r>
-      <w:hyperlink r:id="rId106">
+      <w:hyperlink r:id="rId112">
         <w:r>
           <w:rPr>
             <w:rStyle w:val="Hyperlink"/>
@@ -6258,9 +6570,9 @@
         <w:t xml:space="preserve">.</w:t>
       </w:r>
     </w:p>
-    <w:bookmarkEnd w:id="107"/>
-    <w:bookmarkEnd w:id="108"/>
-    <w:bookmarkEnd w:id="109"/>
+    <w:bookmarkEnd w:id="113"/>
+    <w:bookmarkEnd w:id="114"/>
+    <w:bookmarkEnd w:id="115"/>
     <w:sectPr>
       <w:footnotePr>
         <w:numRestart w:val="eachSect"/>

</xml_diff>